<commit_message>
feat(mo): brief-on-the-merits regenerated on the model at HEAD; docx gated (1050/1050), latex reported (a note after a § token is lost), last paragraph kept with the closing (fb-595.54.59)
Co-Authored-By: Claude Opus 5.5 <noreply@anthropic.com>
</commit_message>
<xml_diff>
--- a/courts/eighth-circuit/missouri/state/supreme-court/brief-on-the-merits/usage/OUTPUT-brief-on-the-merits.docx
+++ b/courts/eighth-circuit/missouri/state/supreme-court/brief-on-the-merits/usage/OUTPUT-brief-on-the-merits.docx
@@ -3731,7 +3731,7 @@
         <w:tab/>
       </w:r>
       <w:r>
-        <w:t xml:space="preserve">36</w:t>
+        <w:t xml:space="preserve">37</w:t>
       </w:r>
     </w:p>
     <w:p>
@@ -13324,7 +13324,7 @@
         <w:pStyle w:val="BodyText"/>
       </w:pPr>
       <w:r>
-        <w:t xml:space="preserve">The operative complaint is the First Amended Petition, which Respondents, a group of officials (the “Officials”), along with the political subdivisions where they work (the “Subdivisions”) filed on December 31, 2019. D2 pp. 1–2 ¶¶ 1–6. The four count petition attacked § 115.646, RSMo, which then provided (emphasis added):</w:t>
+        <w:t xml:space="preserve">The operative complaint is the First Amended Petition, which Respondents, a group of officials (the “Officials”), along with the political subdivisions where they work (the “Subdivisions”) filed on December 31, 2019. D2 pp. 1–2 ¶¶ 1–⁠6. The four count petition attacked § 115.646, RSMo, which then provided (emphasis added):</w:t>
       </w:r>
     </w:p>
     <w:p>
@@ -13346,7 +13346,7 @@
         <w:pStyle w:val="BodyTextNote"/>
       </w:pPr>
       <w:r>
-        <w:t xml:space="preserve">Respondents sought, in Count I, a declaration about the law’s meaning insofar as it applied to ballot measures. D2 pp. 11–12 ¶ 21. Count II alleged that § 115.646’s restriction on using public funds to advocate, support, or oppose a ballot measure is a facially unconstitutional, content-based restriction on the private speech of public officials that violates the First Amendment of the U.S. Constitution. D2 pp. 12–13 ¶¶ 22–26. Count III alleged that the bar on advocating, supporting, or opposing a ballot measure is unconstitutionally vague on its face and thus violates the due process guarantee of the Fourteenth Amendment to the U.S. Constitution. D2 pp. 13–14 ¶¶ 27–29. Count IV alleged that § 115.646 is unconstitutionally overbroad as it relates to ballot measures. D2 pp. 14–16 ¶¶ 30–32.</w:t>
+        <w:t xml:space="preserve">Respondents sought, in Count I, a declaration about the law’s meaning insofar as it applied to ballot measures. D2 pp. 11–12 ¶ 21. Count II alleged that § 115.646’s restriction on using public funds to advocate, support, or oppose a ballot measure is a facially unconstitutional, content-based restriction on the private speech of public officials that violates the First Amendment of the U.S. Constitution. D2 pp. 12–13 ¶¶ 22–⁠26. Count III alleged that the bar on advocating, supporting, or opposing a ballot measure is unconstitutionally vague on its face and thus violates the due process guarantee of the Fourteenth Amendment to the U.S. Constitution. D2 pp. 13–14 ¶¶ 27–⁠29. Count IV alleged that § 115.646 is unconstitutionally overbroad as it relates to ballot measures. D2 pp. 14–16 ¶¶ 30–⁠32.</w:t>
       </w:r>
       <w:r>
         <w:rPr>
@@ -13372,7 +13372,7 @@
         <w:t xml:space="preserve"> </w:t>
       </w:r>
       <w:r>
-        <w:t xml:space="preserve">Missouri did not contest Respondents’ facts. See D37 pp. 1–7 (Missouri’s responses to Respondents’ statement of uncontroverted material facts); D43 p. 3; App. 3 (noting that fact). The Officials claimed that their official duties and § 115.646 conflicted, see D2 p. 5 ¶ 16, in that their officials duties require them “to (i) assess the benefits and detriments of policy outcomes that are determined by ballot measure elections and (ii) communicate those assessments to the city’s constituents prior to those elections, using public resources.” D37 p. 3 (citing affidavits from the Officials). As almost all the Officials said: They believe they have a “responsibility to … [u]se [subdivision] resources to communicate to all [the subdivision’s] constituents the benefits and detriments to the city of any ballot measure to be determined by the [subdivision’s] voters.” D4 p. 4 ¶ 13(c); see also D5 p. 4 ¶ 13(c); D6 p. 5 ¶ 12(c); D33 p. 6 ¶ 12(c); cf. D7 p. 4 ¶ 11(a)–(c) (similar). They also said they had used public resources to engage in such communication in the past. See D37 pp. 3–4; see also D43 p. 2; App. 2.</w:t>
+        <w:t xml:space="preserve">Missouri did not contest Respondents’ facts. See D37 pp. 1–7 (Missouri’s responses to Respondents’ statement of uncontroverted material facts); D43 p. 3; App. 3 (noting that fact). The Officials claimed that their official duties and § 115.646 conflicted, see D2 p. 5 ¶ 16, in that their officials duties require them “to (i) assess the benefits and detriments of policy outcomes that are determined by ballot measure elections and (ii) communicate those assessments to the city’s constituents prior to those elections, using public resources.” D37 p. 3 (citing affidavits from the Officials). As almost all the Officials said: They believe they have a “responsibility to … [u]se [subdivision] resources to communicate to all [the subdivision’s] constituents the benefits and detriments to the city of any ballot measure to be determined by the [subdivision’s] voters.” D4 p. 4 ¶ 13(c); see also D5 p. 4 ¶ 13(c); D6 p. 5 ¶ 12(c); D33 p. 6 ¶ 12(c); cf. D7 p. 4 ¶ 11(a)–⁠(c) (similar). They also said they had used public resources to engage in such communication in the past. See D37 pp. 3–4; see also D43 p. 2; App. 2.</w:t>
       </w:r>
     </w:p>
     <w:p>
@@ -13492,7 +13492,7 @@
         <w:tab/>
       </w:r>
       <w:r>
-        <w:t xml:space="preserve">The scope of the safe harbor provisions. See D4 pp. 6–8 ¶¶ 18–19; D5 pp. 6–8, ¶¶ 18–19; D6 pp. 6–8, ¶¶ 16–17; D33 pp. 7–9, ¶¶ 16–17; see also D7 pp. 5–7, ¶¶ 15–16 (similar, but for a city administrator).</w:t>
+        <w:t xml:space="preserve">The scope of the safe harbor provisions. See D4 pp. 6–8 ¶¶ 18–⁠19; D5 pp. 6–8, ¶¶ 18–⁠19; D6 pp. 6–8, ¶¶ 16–⁠17; D33 pp. 7–9, ¶¶ 16–⁠17; see also D7 pp. 5–7, ¶¶ 15–⁠16 (similar, but for a city administrator).</w:t>
       </w:r>
     </w:p>
     <w:p>
@@ -13580,7 +13580,7 @@
         <w:pStyle w:val="BodyText"/>
       </w:pPr>
       <w:r>
-        <w:t xml:space="preserve">On April 24, 2021, the Circuit Court granted judgment to Respondents on Count II and Count III. The court noted that the Officials “contend … that [§ 115.646], on its face, violates their 1st Amendment right to speak on ballot measures and their 14th Amendment right to be free from the penal enforcement of a vague law.” D43 p. 3; App. 3. The Circuit Court started with Count II and concluded § 115.646 “plainly targets speech based on content” because determining whether an official “is supporting or opposing a particular ballot measure” turns on the content of an official’s (shorthand for “any officer, employee, or agent of any political subdivision” in § 115.646—a shorthand this brief will use) speech. D43 p. 4–5; App. 4–5.</w:t>
+        <w:t xml:space="preserve">On April 24, 2021, the Circuit Court granted judgment to Respondents on Count II and Count III. The court noted that the Officials “contend … that [§ 115.646], on its face, violates their 1st Amendment right to speak on ballot measures and their 14th Amendment right to be free from the penal enforcement of a vague law.” D43 p. 3; App. 3. The Circuit Court started with Count II and concluded § 115.646 “plainly targets speech based on content” because determining whether an official “is supporting or opposing a particular ballot measure” turns on the content of an official’s (shorthand for “any officer, employee, or agent of any political subdivision” in § 115.646—⁠a shorthand this brief will use) speech. D43 p. 4–5; App. 4–5.</w:t>
       </w:r>
     </w:p>
     <w:p>
@@ -13676,7 +13676,7 @@
         <w:tab/>
       </w:r>
       <w:r>
-        <w:t xml:space="preserve">The terms “advocating, supporting, or opposing any ballot measure are also indefinite” according to the Circuit Court. D43 p. 12; App. 12 (alterations and quotations omitted). Specifically, the Circuit Court faulted the context-specific analysis that must occur to determine whether a communication advocated, supported, or opposed a ballot measure. See D43 p. 12; App. 12 (saying the law provides “no guidelines or standards [as to what those terms mean], and they can only be applied—and in effect, defined retroactively—by relying on the contextual facts”). “In some cases the answer will be plain as to whether speech is informationally neutral or constitutes advocacy, support, or opposition,” the Circuit Court admitted, “but answers in most cases will be more elusive … .” D43 p. 12; App. 12.</w:t>
+        <w:t xml:space="preserve">The terms “advocating, supporting, or opposing any ballot measure are also indefinite” according to the Circuit Court. D43 p. 12; App. 12 (alterations and quotations omitted). Specifically, the Circuit Court faulted the context-specific analysis that must occur to determine whether a communication advocated, supported, or opposed a ballot measure. See D43 p. 12; App. 12 (saying the law provides “no guidelines or standards [as to what those terms mean], and they can only be applied—and in effect, defined retroactively—by relying on the contextual facts”). “In some cases the answer will be plain as to whether speech is informationally neutral or constitutes advocacy, support, or opposition,” the Circuit Court admitted, “but answers in most cases will be more elusive … .” D43 p. 12; App. 12.</w:t>
       </w:r>
     </w:p>
     <w:p>
@@ -17682,7 +17682,7 @@
         <w:t xml:space="preserve"> </w:t>
       </w:r>
       <w:r>
-        <w:t xml:space="preserve">of Police v. Montgomery County, 132 A.3d 311, 323 (Md. 2016) (“[I]n the absence of clear and specific prohibitions under State or Federal law, [the government speech doctrine] provides an affirmative basis for government entities to inform the public of their views … .”); cf. Mo. Bankers</w:t>
+        <w:t xml:space="preserve">of Police v. Montgomery County, 132 A.3d 311, 323 (Md. 2016) (“[I]n the absence of clear and specific prohibitions under State or Federal law, [the government speech doctrine] provides an affirmative basis for government entities to inform the public of their views … .”); cf. Mo. Bankers</w:t>
       </w:r>
       <w:r>
         <w:t xml:space="preserve"> </w:t>
@@ -17828,7 +17828,7 @@
         <w:t xml:space="preserve"> </w:t>
       </w:r>
       <w:r>
-        <w:t xml:space="preserve">Sullivan, 500 U.S. 173, 193 (1991) (“The Government can … fund a program to encourage certain activities it believes to be in the public interest, without … funding an alternative program which seeks to deal with the problem … . In so doing, the Government has not discriminated on the basis of viewpoint … .”); Regan</w:t>
+        <w:t xml:space="preserve">Sullivan, 500 U.S. 173, 193 (1991) (“The Government can … fund a program to encourage certain activities it believes to be in the public interest, without … funding an alternative program which seeks to deal with the problem … . In so doing, the Government has not discriminated on the basis of viewpoint … .”); Regan</w:t>
       </w:r>
       <w:r>
         <w:t xml:space="preserve"> </w:t>
@@ -19432,7 +19432,7 @@
         <w:pStyle w:val="BodyText"/>
       </w:pPr>
       <w:r>
-        <w:t xml:space="preserve">First, the law serves the State’s compelling interests in “[p]reserving the integrity of the electoral process, preventing corruption, and sustaining the active, alert responsibility of the individual citizen in a democracy for the wise conduct of government” and “the individual citizen’s confidence in government … .” First Nat’l Bank of Bos. v. Bellotti,</w:t>
+        <w:t xml:space="preserve">First, the law serves the State’s compelling interests in “[p]reserving the integrity of the electoral process, preventing corruption, and sustaining the active, alert responsibility of the individual citizen in a democracy for the wise conduct of government” and “the individual citizen’s confidence in government … .” First Nat’l Bank of Bos. v. Bellotti,</w:t>
       </w:r>
       <w:r>
         <w:t xml:space="preserve"> </w:t>
@@ -19478,7 +19478,7 @@
         <w:t xml:space="preserve"> </w:t>
       </w:r>
       <w:r>
-        <w:t xml:space="preserve">v. City of Boston, 380 N.E.2d 628, 638 (Mass. 1978) (“The Commonwealth has a substantial, compelling interest in assuring the fairness of elections and the appearance of fairness in the electoral process. It may protect that interest by excluding its political subdivisions from partisan involvement in election questions … .”); see also Fraternal Order,</w:t>
+        <w:t xml:space="preserve">v. City of Boston, 380 N.E.2d 628, 638 (Mass. 1978) (“The Commonwealth has a substantial, compelling interest in assuring the fairness of elections and the appearance of fairness in the electoral process. It may protect that interest by excluding its political subdivisions from partisan involvement in election questions … .”); see also Fraternal Order,</w:t>
       </w:r>
       <w:r>
         <w:t xml:space="preserve"> </w:t>
@@ -21092,7 +21092,7 @@
         <w:t xml:space="preserve"> </w:t>
       </w:r>
       <w:r>
-        <w:t xml:space="preserve">THIRD NEW INT’L DICTIONARY (2002) (“without any intervening agency or instrumentality or determining influence : without any intermediate step”).</w:t>
+        <w:t xml:space="preserve">THIRD NEW INT’L DICTIONARY (2002) (“without any intervening agency or instrumentality or determining influence : without any intermediate step”).</w:t>
       </w:r>
     </w:p>
     <w:p>
@@ -21252,7 +21252,7 @@
         <w:t xml:space="preserve"> </w:t>
       </w:r>
       <w:r>
-        <w:t xml:space="preserve">decision explicitly identified a number of materials and activities that unquestionably constitute campaign activities (without any need to consider their ‘style, tenor and timing’)—for example, the use of public funds to purchase bumper stickers, posters, advertising ‘floats,’ or television and radio ‘spots’ … .”). As the Circuit Court admitted, “[i]n some cases the answer will be plain as to whether speech is informationally neutral or constitutes advocacy, support, or opposition … .” D43 p. 12; App. 12.</w:t>
+        <w:t xml:space="preserve">decision explicitly identified a number of materials and activities that unquestionably constitute campaign activities (without any need to consider their ‘style, tenor and timing’)—for example, the use of public funds to purchase bumper stickers, posters, advertising ‘floats,’ or television and radio ‘spots’ … .”). As the Circuit Court admitted, “[i]n some cases the answer will be plain as to whether speech is informationally neutral or constitutes advocacy, support, or opposition … .” D43 p. 12; App. 12.</w:t>
       </w:r>
       <w:r>
         <w:rPr>
@@ -21363,7 +21363,7 @@
     </w:p>
     <w:p>
       <w:pPr>
-        <w:pStyle w:val="BodyText"/>
+        <w:pStyle w:val="BodyTextKeep"/>
       </w:pPr>
       <w:r>
         <w:t xml:space="preserve">For those reasons, Missouri respectfully asks this Court to reverse the judgment of the Circuit Court.</w:t>
@@ -21371,6 +21371,8 @@
     </w:p>
     <w:p>
       <w:pPr>
+        <w:keepNext/>
+        <w:keepLines/>
         <w:spacing w:before="0" w:after="0" w:line="576" w:lineRule="exact"/>
       </w:pPr>
     </w:p>
@@ -22094,13 +22096,7 @@
         <w:t xml:space="preserve"> </w:t>
       </w:r>
       <w:r>
-        <w:t xml:space="preserve">See, e.g., ARIZ. REV. STAT. ANN. § 9</w:t>
-      </w:r>
-      <w:r>
-        <w:noBreakHyphen/>
-      </w:r>
-      <w:r>
-        <w:t xml:space="preserve">500.14;</w:t>
+        <w:t xml:space="preserve">See, e.g., ARIZ. REV. STAT. ANN. § 9-⁠⁠500.14;</w:t>
       </w:r>
       <w:r>
         <w:t xml:space="preserve"> </w:t>
@@ -22112,31 +22108,13 @@
         <w:t xml:space="preserve"> </w:t>
       </w:r>
       <w:r>
-        <w:t xml:space="preserve">COLO. REV. STAT. § 1</w:t>
-      </w:r>
-      <w:r>
-        <w:noBreakHyphen/>
-      </w:r>
-      <w:r>
-        <w:t xml:space="preserve">45</w:t>
-      </w:r>
-      <w:r>
-        <w:noBreakHyphen/>
-      </w:r>
-      <w:r>
-        <w:t xml:space="preserve">117(1)⁠(a)⁠(I);</w:t>
-      </w:r>
-      <w:r>
-        <w:t xml:space="preserve"> </w:t>
-      </w:r>
-      <w:r>
-        <w:t xml:space="preserve">CONN. GEN. STAT. ANN. § 9</w:t>
-      </w:r>
-      <w:r>
-        <w:noBreakHyphen/>
-      </w:r>
-      <w:r>
-        <w:t xml:space="preserve">369b(a)⁠(1)⁠(C)⁠(4);</w:t>
+        <w:t xml:space="preserve">COLO. REV. STAT. § 1-⁠⁠45-⁠⁠117(1)⁠(a)⁠(I);</w:t>
+      </w:r>
+      <w:r>
+        <w:t xml:space="preserve"> </w:t>
+      </w:r>
+      <w:r>
+        <w:t xml:space="preserve">CONN. GEN. STAT. ANN. § 9-⁠⁠369b(a)⁠(1)⁠(C)⁠(4);</w:t>
       </w:r>
       <w:r>
         <w:t xml:space="preserve"> </w:t>
@@ -22382,7 +22360,7 @@
         <w:t xml:space="preserve"> </w:t>
       </w:r>
       <w:r>
-        <w:t xml:space="preserve">The Officials also claimed that the statutory safe harbor—that the law does not “prohibit any public official of a political subdivision from making public appearances or from issuing press releases concerning any such ballot measure,” § 115.646—is vague. See D37 pp. 4–5. The Circuit Court did not address this claim, but there is no reason to believe that the safe harbor lacks a core meaning. See Gerrard</w:t>
+        <w:t xml:space="preserve">The Officials also claimed that the statutory safe harbor—that the law does not “prohibit any public official of a political subdivision from making public appearances or from issuing press releases concerning any such ballot measure,” § 115.646—⁠is vague. See D37 pp. 4–5. The Circuit Court did not address this claim, but there is no reason to believe that the safe harbor lacks a core meaning. See Gerrard</w:t>
       </w:r>
       <w:r>
         <w:t xml:space="preserve"> </w:t>
@@ -23130,6 +23108,7 @@
     <w:unhideWhenUsed/>
     <w:qFormat/>
     <w:pPr>
+      <w:keepLines/>
       <w:spacing w:before="0" w:after="130" w:line="299" w:lineRule="exact"/>
     </w:pPr>
     <w:rPr>
@@ -23328,6 +23307,15 @@
       <w:ind w:firstLine="720"/>
     </w:pPr>
   </w:style>
+  <w:style w:type="paragraph" w:customStyle="1" w:styleId="BodyTextKeep">
+    <w:name w:val="Body Text Keep"/>
+    <w:basedOn w:val="BodyText"/>
+    <w:qFormat/>
+    <w:pPr>
+      <w:keepNext/>
+      <w:keepLines/>
+    </w:pPr>
+  </w:style>
   <w:style w:type="paragraph" w:customStyle="1" w:styleId="XdList1">
     <w:name w:val="XdList 1"/>
     <w:basedOn w:val="Normal"/>
@@ -23380,6 +23368,33 @@
     <w:pPr>
       <w:spacing w:before="0" w:after="0" w:line="299" w:lineRule="exact"/>
       <w:ind w:left="2160" w:hanging="720"/>
+    </w:pPr>
+  </w:style>
+  <w:style w:type="paragraph" w:customStyle="1" w:styleId="XdQuoteList1">
+    <w:name w:val="Xd Quote List 1"/>
+    <w:basedOn w:val="Normal"/>
+    <w:qFormat/>
+    <w:pPr>
+      <w:spacing w:before="0" w:after="0" w:line="299" w:lineRule="exact"/>
+      <w:ind w:left="1440" w:right="720" w:hanging="720"/>
+    </w:pPr>
+  </w:style>
+  <w:style w:type="paragraph" w:customStyle="1" w:styleId="XdQuoteList2">
+    <w:name w:val="Xd Quote List 2"/>
+    <w:basedOn w:val="Normal"/>
+    <w:qFormat/>
+    <w:pPr>
+      <w:spacing w:before="0" w:after="0" w:line="299" w:lineRule="exact"/>
+      <w:ind w:left="2160" w:right="720" w:hanging="720"/>
+    </w:pPr>
+  </w:style>
+  <w:style w:type="paragraph" w:customStyle="1" w:styleId="XdQuoteList3">
+    <w:name w:val="Xd Quote List 3"/>
+    <w:basedOn w:val="Normal"/>
+    <w:qFormat/>
+    <w:pPr>
+      <w:spacing w:before="0" w:after="0" w:line="299" w:lineRule="exact"/>
+      <w:ind w:left="2880" w:right="720" w:hanging="720"/>
     </w:pPr>
   </w:style>
   <w:style w:type="paragraph" w:customStyle="1" w:styleId="XdList1">

</xml_diff>